<commit_message>
Add KC/SC mappings and barcode findings
</commit_message>
<xml_diff>
--- a/output/doc/FINDINGS_KC.docx
+++ b/output/doc/FINDINGS_KC.docx
@@ -618,6 +618,47 @@
         <w:pStyle w:val="Heading2"/>
       </w:pPr>
       <w:r>
+        <w:t>Oversize barcode list (all counties)</w:t>
+      </w:r>
+    </w:p>
+    <w:p>
+      <w:pPr>
+        <w:pStyle w:val="ListBullet"/>
+      </w:pPr>
+      <w:r>
+        <w:t>Source: access-dbs/All Counties Orphans Court Oversize.mdb (table: Oversize Orphan Court Names-Kent).</w:t>
+      </w:r>
+    </w:p>
+    <w:p>
+      <w:pPr>
+        <w:pStyle w:val="ListBullet"/>
+      </w:pPr>
+      <w:r>
+        <w:t>Rows: 1,378 (barcodes populated for all rows).</w:t>
+      </w:r>
+    </w:p>
+    <w:p>
+      <w:pPr>
+        <w:pStyle w:val="ListBullet"/>
+      </w:pPr>
+      <w:r>
+        <w:t>Name matches to KC Adults (last + first): 1,145.</w:t>
+      </w:r>
+    </w:p>
+    <w:p>
+      <w:pPr>
+        <w:pStyle w:val="ListBullet"/>
+      </w:pPr>
+      <w:r>
+        <w:t>No Location ID present; usable only for Barcode field on oversize records.</w:t>
+      </w:r>
+    </w:p>
+    <w:p/>
+    <w:p>
+      <w:pPr>
+        <w:pStyle w:val="Heading2"/>
+      </w:pPr>
+      <w:r>
         <w:t>Puzzle pieces (XLSX)</w:t>
       </w:r>
     </w:p>

</xml_diff>

<commit_message>
Update findings, questions, and dashboard
</commit_message>
<xml_diff>
--- a/output/doc/FINDINGS_KC.docx
+++ b/output/doc/FINDINGS_KC.docx
@@ -466,6 +466,22 @@
         <w:pStyle w:val="ListBullet"/>
       </w:pPr>
       <w:r>
+        <w:t>Among shared IDs (6,233), 3,094 have at least one differing value.</w:t>
+      </w:r>
+    </w:p>
+    <w:p>
+      <w:pPr>
+        <w:pStyle w:val="ListBullet"/>
+      </w:pPr>
+      <w:r>
+        <w:t>Top differing columns: Deceased's Middle name (1,438), Barcode (932), Comments (870), Container Type (417).</w:t>
+      </w:r>
+    </w:p>
+    <w:p>
+      <w:pPr>
+        <w:pStyle w:val="ListBullet"/>
+      </w:pPr>
+      <w:r>
         <w:t>Recommendation: treat `Adults` as the primary table unless you want a reconciliation step.</w:t>
       </w:r>
     </w:p>
@@ -692,7 +708,7 @@
         <w:pStyle w:val="ListBullet"/>
       </w:pPr>
       <w:r>
-        <w:t>Children table uses `Child's Last Name`, `Children's Record ID`, `Comments - Child`, etc.</w:t>
+        <w:t>Children table columns are shifted: `Parent's First Name` is numeric and ` etc` matches Adults last names ~90%. Mapping was corrected accordingly.</w:t>
       </w:r>
     </w:p>
     <w:p>
@@ -700,7 +716,7 @@
         <w:pStyle w:val="ListBullet"/>
       </w:pPr>
       <w:r>
-        <w:t>For the migration script, we will need a KC-specific mapping or a renaming step before import.</w:t>
+        <w:t>For the migration script, use the KC-specific mapping (not a simple rename) to avoid swapped fields.</w:t>
       </w:r>
     </w:p>
     <w:p/>
@@ -717,7 +733,23 @@
         <w:pStyle w:val="ListBullet"/>
       </w:pPr>
       <w:r>
-        <w:t>Container list is not present in the KC .mdb export; we need a separate container source for barcode/location lookups.</w:t>
+        <w:t>No KC container list found anywhere in the Access exports or local files. Location ID data is missing.</w:t>
+      </w:r>
+    </w:p>
+    <w:p>
+      <w:pPr>
+        <w:pStyle w:val="ListBullet"/>
+      </w:pPr>
+      <w:r>
+        <w:t>Barcode can come only from Adults (143 rows) or the oversize list (if we merge it later).</w:t>
+      </w:r>
+    </w:p>
+    <w:p>
+      <w:pPr>
+        <w:pStyle w:val="ListBullet"/>
+      </w:pPr>
+      <w:r>
+        <w:t>Output uses the parent/adult barcode when present; children inherit the parent barcode.</w:t>
       </w:r>
     </w:p>
     <w:sectPr>

</xml_diff>